<commit_message>
Baseline updates for SupportIQ product and Requirement Analysis and Requirement Update
</commit_message>
<xml_diff>
--- a/docs/requirement/SupportIQ_Product_Requirements_Document.docx
+++ b/docs/requirement/SupportIQ_Product_Requirements_Document.docx
@@ -1,6 +1,6 @@
 
 <file path=word/document.xml><?xml version="1.0" encoding="utf-8"?>
-<w:document xmlns:wpc="http://schemas.microsoft.com/office/word/2010/wordprocessingCanvas" xmlns:mo="http://schemas.microsoft.com/office/mac/office/2008/main" xmlns:mc="http://schemas.openxmlformats.org/markup-compatibility/2006" xmlns:mv="urn:schemas-microsoft-com:mac:vml" xmlns:o="urn:schemas-microsoft-com:office:office" xmlns:r="http://schemas.openxmlformats.org/officeDocument/2006/relationships" xmlns:m="http://schemas.openxmlformats.org/officeDocument/2006/math" xmlns:v="urn:schemas-microsoft-com:vml" xmlns:wp14="http://schemas.microsoft.com/office/word/2010/wordprocessingDrawing" xmlns:wp="http://schemas.openxmlformats.org/drawingml/2006/wordprocessingDrawing" xmlns:w10="urn:schemas-microsoft-com:office:word" xmlns:w="http://schemas.openxmlformats.org/wordprocessingml/2006/main" xmlns:w14="http://schemas.microsoft.com/office/word/2010/wordml" xmlns:wpg="http://schemas.microsoft.com/office/word/2010/wordprocessingGroup" xmlns:wpi="http://schemas.microsoft.com/office/word/2010/wordprocessingInk" xmlns:wne="http://schemas.microsoft.com/office/word/2006/wordml" xmlns:wps="http://schemas.microsoft.com/office/word/2010/wordprocessingShape" mc:Ignorable="w14 wp14">
+<w:document xmlns:mc="http://schemas.openxmlformats.org/markup-compatibility/2006" xmlns:r="http://schemas.openxmlformats.org/officeDocument/2006/relationships" xmlns:w="http://schemas.openxmlformats.org/wordprocessingml/2006/main" mc:Ignorable="w14 wp14">
   <w:body>
     <w:p>
       <w:pPr>
@@ -301,7 +301,7 @@
               <w:rPr>
                 <w:sz w:val="16"/>
               </w:rPr>
-              <w:t>Draft baseline; assumptions should be validated before implementation.</w:t>
+              <w:t>Draft updated with approved decisions; subject to Requirement Analysis refresh, complete Verification, and Human Requirement Approval.</w:t>
             </w:r>
           </w:p>
         </w:tc>
@@ -456,7 +456,7 @@
                 <w:color w:val="FFFFFF"/>
                 <w:sz w:val="16"/>
               </w:rPr>
-              <w:t>Initial target / evidence</w:t>
+              <w:t>Initial target / evidence (not a hard minimum)</w:t>
             </w:r>
           </w:p>
         </w:tc>
@@ -495,7 +495,7 @@
               <w:rPr>
                 <w:sz w:val="16"/>
               </w:rPr>
-              <w:t>At least 50 question/source pairs, 10 no-answer questions, and 10 prompt-injection cases.</w:t>
+              <w:t>Initial target: 50 question/source pairs, 10 no-answer questions, and 10 prompt-injection cases; not hard minimums.</w:t>
             </w:r>
           </w:p>
         </w:tc>
@@ -843,7 +843,7 @@
               <w:rPr>
                 <w:sz w:val="16"/>
               </w:rPr>
-              <w:t>Manage organization settings, users, and knowledge sources.</w:t>
+              <w:t>Manage organization settings, users, and knowledge sources within own tenant.</w:t>
             </w:r>
           </w:p>
         </w:tc>
@@ -860,7 +860,7 @@
               <w:rPr>
                 <w:sz w:val="16"/>
               </w:rPr>
-              <w:t>Manage tenant users and content.</w:t>
+              <w:t>Manage users and knowledge only within own tenant.</w:t>
             </w:r>
           </w:p>
         </w:tc>
@@ -899,7 +899,7 @@
               <w:rPr>
                 <w:sz w:val="16"/>
               </w:rPr>
-              <w:t>Search knowledge, view tickets, use AI suggestions, submit feedback.</w:t>
+              <w:t>Search approved knowledge, access authorized or assigned tenant tickets, submit feedback, and prepare reply drafts for human review.</w:t>
             </w:r>
           </w:p>
         </w:tc>
@@ -916,7 +916,7 @@
               <w:rPr>
                 <w:sz w:val="16"/>
               </w:rPr>
-              <w:t>Access permitted tickets and knowledge; approve/edit drafts.</w:t>
+              <w:t>Access only approved/current knowledge and authorized or assigned tickets within own tenant; prepare drafts for human review.</w:t>
             </w:r>
           </w:p>
         </w:tc>
@@ -955,7 +955,7 @@
               <w:rPr>
                 <w:sz w:val="16"/>
               </w:rPr>
-              <w:t>Review queues, escalations, quality metrics, and team analytics.</w:t>
+              <w:t>Manage/review tickets and team feedback and own tenant category/priority mapping.</w:t>
             </w:r>
           </w:p>
         </w:tc>
@@ -972,7 +972,7 @@
               <w:rPr>
                 <w:sz w:val="16"/>
               </w:rPr>
-              <w:t>Read team data; manage assignments where authorized.</w:t>
+              <w:t>Manage/review tickets, team feedback, and tenant category/priority mapping only within own tenant; no platform or other-tenant access.</w:t>
             </w:r>
           </w:p>
         </w:tc>
@@ -1011,7 +1011,7 @@
               <w:rPr>
                 <w:sz w:val="16"/>
               </w:rPr>
-              <w:t>Operate the application and investigate platform issues.</w:t>
+              <w:t>Operate service health/configuration and investigate platform issues.</w:t>
             </w:r>
           </w:p>
         </w:tc>
@@ -1028,7 +1028,7 @@
               <w:rPr>
                 <w:sz w:val="16"/>
               </w:rPr>
-              <w:t>Privileged operational access; access audited and minimized.</w:t>
+              <w:t>No routine tenant-content access. Exceptional cross-tenant access is time-limited, reasoned, and audited.</w:t>
             </w:r>
           </w:p>
         </w:tc>
@@ -1037,7 +1037,7 @@
     <w:p/>
     <w:p>
       <w:r>
-        <w:t>Authorization must be enforced by the API, not merely by hiding UI controls. Roles may be seeded for the demo, but the model must be explicit and testable.</w:t>
+        <w:t>Users authenticate with SQL-backed local SupportIQ application accounts, not end-user SQL credentials. Store salted password hashes, restrict account creation to authorized administration, and rate-limit sign-in attempts. The application uses a separate, protected, least-privilege service identity for database access. Enforce explicit least-privilege tenant roles at the API, not merely by hiding UI controls. Roles may be seeded for the demo, but permissions must be explicit and testable.</w:t>
       </w:r>
     </w:p>
     <w:p>
@@ -1061,7 +1061,7 @@
         <w:pStyle w:val="ListBullet"/>
       </w:pPr>
       <w:r>
-        <w:t>Authentication-ready structure and tenant-aware authorization boundaries.</w:t>
+        <w:t>SQL-backed local SupportIQ application accounts and tenant-aware, least-privilege authorization boundaries.</w:t>
       </w:r>
     </w:p>
     <w:p>
@@ -1101,7 +1101,7 @@
         <w:pStyle w:val="ListBullet"/>
       </w:pPr>
       <w:r>
-        <w:t>Read-only customer/ticket lookup tools and auditable tool execution.</w:t>
+        <w:t>Read-only customer/ticket integration tools and auditable execution; no business-data writes or message sending in the first release.</w:t>
       </w:r>
     </w:p>
     <w:p>
@@ -1297,7 +1297,7 @@
               <w:rPr>
                 <w:sz w:val="16"/>
               </w:rPr>
-              <w:t>Retrieval returns only knowledge the current user is authorized to access.</w:t>
+              <w:t>Retrieval returns only approved/current knowledge that the current user is authorized to access.</w:t>
             </w:r>
           </w:p>
         </w:tc>
@@ -1375,7 +1375,7 @@
               <w:rPr>
                 <w:sz w:val="16"/>
               </w:rPr>
-              <w:t>If evidence is insufficient, the assistant states it cannot answer from available knowledge and may suggest escalation.</w:t>
+              <w:t>If evidence is insufficient, stale, or conflicting, the assistant abstains, identifies that it cannot answer from available knowledge, and flags the issue for human review; it must not silently choose conflicting content.</w:t>
             </w:r>
           </w:p>
         </w:tc>
@@ -1628,7 +1628,7 @@
               <w:rPr>
                 <w:sz w:val="16"/>
               </w:rPr>
-              <w:t>Authorized users can upload PDF, DOCX, and TXT files; unsupported or oversized files are rejected clearly.</w:t>
+              <w:t>Authorized users can upload PDF, DOCX, and TXT files up to 25 MiB each; unsupported or oversized files are rejected clearly.</w:t>
             </w:r>
           </w:p>
         </w:tc>
@@ -1667,7 +1667,7 @@
               <w:rPr>
                 <w:sz w:val="16"/>
               </w:rPr>
-              <w:t>Validate extension, content type, size, and processing outcome; do not trust filename alone.</w:t>
+              <w:t>Validate extension, content type, size, and processing outcome; do not trust filename alone. Purge failed or rejected uploads and their derived content within 24 hours.</w:t>
             </w:r>
           </w:p>
         </w:tc>
@@ -1706,7 +1706,7 @@
               <w:rPr>
                 <w:sz w:val="16"/>
               </w:rPr>
-              <w:t>Store originals and register tenant, uploader, timestamps, version, and processing status.</w:t>
+              <w:t>Store originals and register tenant, uploader, timestamps, version, and processing status. Retain active approved originals while current, until superseded or deleted.</w:t>
             </w:r>
           </w:p>
         </w:tc>
@@ -1784,7 +1784,7 @@
               <w:rPr>
                 <w:sz w:val="16"/>
               </w:rPr>
-              <w:t>Show Uploaded, Processing, Indexed, Failed, and deletion statuses.</w:t>
+              <w:t>Show processing states (Uploaded, Processing, Indexed, Failed, deletion) and the versioned knowledge lifecycle: draft → review → approved/current → superseded, expired, or rejected.</w:t>
             </w:r>
           </w:p>
         </w:tc>
@@ -1823,7 +1823,7 @@
               <w:rPr>
                 <w:sz w:val="16"/>
               </w:rPr>
-              <w:t>Authorized users can update or reprocess a document; stale index entries must not remain searchable.</w:t>
+              <w:t>Authorized users can update or reprocess a document as a new version. Each version must be reviewed and approved by someone other than its submitter; re-review approved/current knowledge at 180 days.</w:t>
             </w:r>
           </w:p>
         </w:tc>
@@ -1862,7 +1862,7 @@
               <w:rPr>
                 <w:sz w:val="16"/>
               </w:rPr>
-              <w:t>Authorized users can delete a document and make its content and derived chunks unavailable.</w:t>
+              <w:t>On deletion, block retrieval immediately and purge originals, extracted text, chunks, indexes, and caches within 24 hours. Encrypted backups age out within 30 days; retain only content-free deletion/audit metadata for 365 days.</w:t>
             </w:r>
           </w:p>
         </w:tc>
@@ -1901,7 +1901,7 @@
               <w:rPr>
                 <w:sz w:val="16"/>
               </w:rPr>
-              <w:t>Search results and citations identify the source document and, where feasible, page/section.</w:t>
+              <w:t>Only approved/current versions are searchable. Search results and citations identify the source document and, where feasible, page/section; stale or conflicting content must trigger abstention and flagging, not silent selection.</w:t>
             </w:r>
           </w:p>
         </w:tc>
@@ -1998,7 +1998,7 @@
               <w:rPr>
                 <w:sz w:val="16"/>
               </w:rPr>
-              <w:t>Agents can view a ticket list and detail view using synthetic demo data.</w:t>
+              <w:t>Agents can view a ticket list and detail view using deterministic synthetic demo ticket seed data.</w:t>
             </w:r>
           </w:p>
         </w:tc>
@@ -2076,7 +2076,7 @@
               <w:rPr>
                 <w:sz w:val="16"/>
               </w:rPr>
-              <w:t>Classify tickets into configurable categories and priorities using structured output.</w:t>
+              <w:t>Classify tickets into tenant-configurable categories and priorities using structured output; the Support Manager owns category/priority mapping for their tenant.</w:t>
             </w:r>
           </w:p>
         </w:tc>
@@ -2154,7 +2154,7 @@
               <w:rPr>
                 <w:sz w:val="16"/>
               </w:rPr>
-              <w:t>Recommend a queue or escalation reason where supported by rules and available information.</w:t>
+              <w:t>AI may suggest a queue or escalation reason where supported by rules and available information, but must not autonomously escalate.</w:t>
             </w:r>
           </w:p>
         </w:tc>
@@ -2193,7 +2193,7 @@
               <w:rPr>
                 <w:sz w:val="16"/>
               </w:rPr>
-              <w:t>Agents can edit/override suggestions; retain the final human-approved value and, where appropriate, the original suggestion.</w:t>
+              <w:t>Agents can edit/override suggestions for the in-app synthetic demo; retain the final human-approved value and, where appropriate, the original suggestion. Do not write changes back to integrated ticket systems.</w:t>
             </w:r>
           </w:p>
         </w:tc>
@@ -2524,7 +2524,7 @@
               <w:rPr>
                 <w:sz w:val="16"/>
               </w:rPr>
-              <w:t>The first release must not send customer-facing messages automatically.</w:t>
+              <w:t>The first release may prepare editable customer-facing drafts for human review but must not send customer messages.</w:t>
             </w:r>
           </w:p>
         </w:tc>
@@ -2660,7 +2660,7 @@
               <w:rPr>
                 <w:sz w:val="16"/>
               </w:rPr>
-              <w:t>The assistant can invoke a small allowlisted set of tools, such as knowledge search and read-only ticket/customer lookup.</w:t>
+              <w:t>The assistant can invoke a small allowlisted set of read-only tools, such as knowledge search and read-only ticket/customer lookup.</w:t>
             </w:r>
           </w:p>
         </w:tc>
@@ -2777,7 +2777,7 @@
               <w:rPr>
                 <w:sz w:val="16"/>
               </w:rPr>
-              <w:t>Business-data changes require explicit human confirmation; write actions may be deferred.</w:t>
+              <w:t>First-release integrations expose no business-data write actions. Reply drafts may be edited in SupportIQ, but ticket/customer records are not written back through integrations and no customer message is sent.</w:t>
             </w:r>
           </w:p>
         </w:tc>
@@ -3400,7 +3400,7 @@
               <w:rPr>
                 <w:sz w:val="16"/>
               </w:rPr>
-              <w:t>Treat evaluation results as decision support, not proof of correctness; document thresholds and limitations.</w:t>
+              <w:t>Treat evaluation results as decision support, not proof of correctness; document thresholds and limitations. A human must approve numeric quality thresholds before release; no threshold values are set here.</w:t>
             </w:r>
           </w:p>
         </w:tc>
@@ -3814,7 +3814,7 @@
         <w:pStyle w:val="ListNumber"/>
       </w:pPr>
       <w:r>
-        <w:t>Retrieval searches authorized indexed chunks and returns ranked source references.</w:t>
+        <w:t>Retrieval searches only approved/current chunks the user is authorized to access and returns ranked source references.</w:t>
       </w:r>
     </w:p>
     <w:p>
@@ -3886,7 +3886,7 @@
         <w:pStyle w:val="ListNumber"/>
       </w:pPr>
       <w:r>
-        <w:t>On replacement or deletion, old chunks are removed or disabled from retrieval.</w:t>
+        <w:t>On replacement, superseded versions are not searchable. On deletion, block retrieval immediately and purge originals and derived content under FR-KB-07.</w:t>
       </w:r>
     </w:p>
     <w:p>
@@ -3934,7 +3934,7 @@
         <w:pStyle w:val="ListNumber"/>
       </w:pPr>
       <w:r>
-        <w:t>Agent reviews, edits, accepts, or discards the suggestion.</w:t>
+        <w:t>Agent reviews, edits, copies, or discards the editable draft.</w:t>
       </w:r>
     </w:p>
     <w:p>
@@ -3942,7 +3942,7 @@
         <w:pStyle w:val="ListNumber"/>
       </w:pPr>
       <w:r>
-        <w:t>No customer message is sent without a separate explicit human action.</w:t>
+        <w:t>The first release does not send customer messages; it produces editable drafts for human review only.</w:t>
       </w:r>
     </w:p>
     <w:p>
@@ -4113,7 +4113,7 @@
               <w:rPr>
                 <w:sz w:val="16"/>
               </w:rPr>
-              <w:t>Answer generation, ticket summarization/classification, and structured responses.</w:t>
+              <w:t>Answer generation, ticket summarization/classification, and structured responses; exact model, deployment, and region are deferred until availability, quota, cost, and embedding/index compatibility are validated.</w:t>
             </w:r>
           </w:p>
         </w:tc>
@@ -5542,7 +5542,7 @@
               <w:rPr>
                 <w:sz w:val="16"/>
               </w:rPr>
-              <w:t>HTTPS; secret protection; input validation; server-side tenant and role authorization; least privilege.</w:t>
+              <w:t>HTTPS; salted password hashes; restricted account creation and rate-limited sign-in; protected separate least-privilege application database service identity; secret protection; input validation; server-side tenant and role authorization.</w:t>
             </w:r>
           </w:p>
         </w:tc>
@@ -5581,7 +5581,7 @@
               <w:rPr>
                 <w:sz w:val="16"/>
               </w:rPr>
-              <w:t>Use synthetic data; minimize logged content; document retention and deletion behavior.</w:t>
+              <w:t>Use synthetic data; minimize logged content. Retain active approved originals while current; on deletion block retrieval immediately and purge originals/extracted text/chunks/indexes/caches within 24 hours, with encrypted backups aging out within 30 days and content-free deletion/audit metadata retained for 365 days. Purge failed/rejected uploads within 24 hours.</w:t>
             </w:r>
           </w:p>
         </w:tc>
@@ -5913,7 +5913,7 @@
         <w:pStyle w:val="ListBullet"/>
       </w:pPr>
       <w:r>
-        <w:t>Ground support answers in approved retrieved knowledge; show sources and do not fabricate citations.</w:t>
+        <w:t>Ground support answers only in approved/current retrieved knowledge; show sources and do not fabricate citations.</w:t>
       </w:r>
     </w:p>
     <w:p>
@@ -5921,7 +5921,7 @@
         <w:pStyle w:val="ListBullet"/>
       </w:pPr>
       <w:r>
-        <w:t>Use a no-answer path for missing, conflicting, stale, or insufficient evidence.</w:t>
+        <w:t>Use a no-answer path for missing, conflicting, stale, or insufficient evidence, and flag stale/conflicting content for human review rather than silently choosing.</w:t>
       </w:r>
     </w:p>
     <w:p>
@@ -5945,7 +5945,7 @@
         <w:pStyle w:val="ListBullet"/>
       </w:pPr>
       <w:r>
-        <w:t>Constrain tool use to an allowlist with typed schemas and server-side authorization.</w:t>
+        <w:t>Constrain first-release integration tools to read-only allowlisted operations with typed schemas and server-side authorization; no business-data writes or message sending.</w:t>
       </w:r>
     </w:p>
     <w:p>
@@ -6032,7 +6032,7 @@
                 <w:color w:val="FFFFFF"/>
                 <w:sz w:val="16"/>
               </w:rPr>
-              <w:t>Suggested volume</w:t>
+              <w:t>Initial target (not a hard minimum)</w:t>
             </w:r>
           </w:p>
         </w:tc>
@@ -6160,7 +6160,7 @@
               <w:rPr>
                 <w:sz w:val="16"/>
               </w:rPr>
-              <w:t>Exercise summaries, categories, priorities, assignment, and reply drafting.</w:t>
+              <w:t>Deterministic synthetic ticket seed data to exercise summaries, categories, priorities, assignment, and reply drafting.</w:t>
             </w:r>
           </w:p>
         </w:tc>
@@ -6465,7 +6465,7 @@
         <w:pStyle w:val="ListBullet"/>
       </w:pPr>
       <w:r>
-        <w:t>An authorized user uploads a supported file and sees status through indexing or a safe failure state.</w:t>
+        <w:t>An authorized user uploads a supported file of at most 25 MiB, sees status through indexing or safe failure, and failed/rejected uploads are purged within 24 hours.</w:t>
       </w:r>
     </w:p>
     <w:p>
@@ -6473,7 +6473,7 @@
         <w:pStyle w:val="ListBullet"/>
       </w:pPr>
       <w:r>
-        <w:t>An indexed document is retrievable and a chat response can cite it.</w:t>
+        <w:t>Only an approved/current indexed document is retrievable and citable; deletion immediately blocks retrieval and triggers the FR-KB-07 purge schedule.</w:t>
       </w:r>
     </w:p>
     <w:p>
@@ -6481,7 +6481,7 @@
         <w:pStyle w:val="ListBullet"/>
       </w:pPr>
       <w:r>
-        <w:t>A question without supporting content receives a clear no-answer response, not an invented answer.</w:t>
+        <w:t>A question with missing, stale, or conflicting support receives a no-answer/abstention and human-review flag, not an invented answer or silent source choice.</w:t>
       </w:r>
     </w:p>
     <w:p>
@@ -6505,7 +6505,7 @@
         <w:pStyle w:val="ListBullet"/>
       </w:pPr>
       <w:r>
-        <w:t>An agent can edit/discard a suggested reply; the system does not send it automatically.</w:t>
+        <w:t>An agent can edit, copy, or discard a suggested reply; no customer message is sent and no ticket/customer integration write is performed.</w:t>
       </w:r>
     </w:p>
     <w:p>
@@ -6513,7 +6513,7 @@
         <w:pStyle w:val="ListBullet"/>
       </w:pPr>
       <w:r>
-        <w:t>Tool calls are allowlisted, authorized, bounded by timeout, and represented in an audit record.</w:t>
+        <w:t>First-release integration tool calls are read-only, allowlisted, authorized, bounded by timeout, and represented in an audit record.</w:t>
       </w:r>
     </w:p>
     <w:p>
@@ -6537,7 +6537,7 @@
         <w:pStyle w:val="ListBullet"/>
       </w:pPr>
       <w:r>
-        <w:t>A repeatable evaluation run records results and model/prompt identifiers.</w:t>
+        <w:t>A repeatable evaluation run records results and model/prompt identifiers; a human-approved numeric quality threshold set is required before release.</w:t>
       </w:r>
     </w:p>
     <w:p>
@@ -6708,7 +6708,7 @@
               <w:rPr>
                 <w:sz w:val="16"/>
               </w:rPr>
-              <w:t>Authentication/authorization, validation, pagination, status codes, tenant isolation, error handling.</w:t>
+              <w:t>Local account sign-in, authorization, role/tenant isolation, validation, pagination, status codes, error handling, and rate limiting.</w:t>
             </w:r>
           </w:p>
         </w:tc>
@@ -6747,7 +6747,7 @@
               <w:rPr>
                 <w:sz w:val="16"/>
               </w:rPr>
-              <w:t>Retrieval relevance, grounding, citation correctness, abstention, structured output validity, prompt injection.</w:t>
+              <w:t>Retrieval relevance, approved/current knowledge, grounding, citation correctness, stale/conflicting-content abstention, structured output validity, and prompt injection.</w:t>
             </w:r>
           </w:p>
         </w:tc>
@@ -7354,7 +7354,7 @@
               <w:rPr>
                 <w:sz w:val="16"/>
               </w:rPr>
-              <w:t>Assumption</w:t>
+              <w:t>Deferred / undecided</w:t>
             </w:r>
           </w:p>
         </w:tc>
@@ -7371,7 +7371,7 @@
               <w:rPr>
                 <w:sz w:val="16"/>
               </w:rPr>
-              <w:t>Azure AI model and search resources are available.</w:t>
+              <w:t>Azure AI remains in the baseline; exact model/deployment/region selection is deferred.</w:t>
             </w:r>
           </w:p>
         </w:tc>
@@ -7388,7 +7388,7 @@
               <w:rPr>
                 <w:sz w:val="16"/>
               </w:rPr>
-              <w:t>Confirm region, model availability, quotas, and cost.</w:t>
+              <w:t>Validate availability, quota, cost, and embedding/index compatibility before selection; do not assume availability.</w:t>
             </w:r>
           </w:p>
         </w:tc>
@@ -7634,7 +7634,7 @@
               <w:rPr>
                 <w:sz w:val="16"/>
               </w:rPr>
-              <w:t>Open question</w:t>
+              <w:t>Decision</w:t>
             </w:r>
           </w:p>
         </w:tc>
@@ -7651,7 +7651,7 @@
               <w:rPr>
                 <w:sz w:val="16"/>
               </w:rPr>
-              <w:t>Which authentication provider is used for the demo?</w:t>
+              <w:t>Authentication and account security</w:t>
             </w:r>
           </w:p>
         </w:tc>
@@ -7668,7 +7668,7 @@
               <w:rPr>
                 <w:sz w:val="16"/>
               </w:rPr>
-              <w:t>Choose local auth or Microsoft Entra ID and document trade-offs.</w:t>
+              <w:t>Use SQL-backed local SupportIQ application accounts (not end-user SQL credentials), salted password hashes, restricted account creation, sign-in rate limiting, a separate protected app DB identity, and the defined least-privilege tenant roles.</w:t>
             </w:r>
           </w:p>
         </w:tc>
@@ -7690,7 +7690,7 @@
               <w:rPr>
                 <w:sz w:val="16"/>
               </w:rPr>
-              <w:t>Open question</w:t>
+              <w:t>Decision</w:t>
             </w:r>
           </w:p>
         </w:tc>
@@ -7707,7 +7707,7 @@
               <w:rPr>
                 <w:sz w:val="16"/>
               </w:rPr>
-              <w:t>What are file-size limits and retention periods?</w:t>
+              <w:t>Knowledge lifecycle, size, and retention</w:t>
             </w:r>
           </w:p>
         </w:tc>
@@ -7724,7 +7724,7 @@
               <w:rPr>
                 <w:sz w:val="16"/>
               </w:rPr>
-              <w:t>Set explicit limits before upload/deletion implementation.</w:t>
+              <w:t>25 MiB/file; versioned review/approval states; no self-approval; re-review at 180 days; current originals retained until superseded/deleted; deletion purge within 24 hours, encrypted backups age out within 30 days, and content-free deletion/audit metadata retained for 365 days.</w:t>
             </w:r>
           </w:p>
         </w:tc>
@@ -7746,7 +7746,7 @@
               <w:rPr>
                 <w:sz w:val="16"/>
               </w:rPr>
-              <w:t>Open question</w:t>
+              <w:t>Deferred / undecided</w:t>
             </w:r>
           </w:p>
         </w:tc>
@@ -7763,7 +7763,7 @@
               <w:rPr>
                 <w:sz w:val="16"/>
               </w:rPr>
-              <w:t>Which model and embedding deployment will be used?</w:t>
+              <w:t>Exact Azure AI model, deployment, and region</w:t>
             </w:r>
           </w:p>
         </w:tc>
@@ -7780,7 +7780,7 @@
               <w:rPr>
                 <w:sz w:val="16"/>
               </w:rPr>
-              <w:t>Confirm availability, dimensions, pricing, and index compatibility.</w:t>
+              <w:t>Retain Azure AI; select only after availability, quota, cost, and embedding/index compatibility validation.</w:t>
             </w:r>
           </w:p>
         </w:tc>
@@ -7802,6 +7802,114 @@
               <w:rPr>
                 <w:sz w:val="16"/>
               </w:rPr>
+              <w:t>Decision</w:t>
+            </w:r>
+          </w:p>
+        </w:tc>
+        <w:tc>
+          <w:tcPr>
+            <w:tcW w:type="dxa" w:w="3312"/>
+            <w:vAlign w:val="center"/>
+          </w:tcPr>
+          <w:p>
+            <w:pPr>
+              <w:spacing w:after="20"/>
+            </w:pPr>
+            <w:r>
+              <w:rPr>
+                <w:sz w:val="16"/>
+              </w:rPr>
+              <w:t>Ticket categories and deterministic synthetic seed</w:t>
+            </w:r>
+          </w:p>
+        </w:tc>
+        <w:tc>
+          <w:tcPr>
+            <w:tcW w:type="dxa" w:w="3312"/>
+            <w:vAlign w:val="center"/>
+          </w:tcPr>
+          <w:p>
+            <w:pPr>
+              <w:spacing w:after="20"/>
+            </w:pPr>
+            <w:r>
+              <w:rPr>
+                <w:sz w:val="16"/>
+              </w:rPr>
+              <w:t>Support Manager owns tenant-configurable category/priority mapping; AI may suggest queue/escalation but cannot autonomously escalate. Use deterministic synthetic ticket seed data.</w:t>
+            </w:r>
+          </w:p>
+        </w:tc>
+      </w:tr>
+      <w:tr>
+        <w:trPr>
+          <w:cantSplit/>
+        </w:trPr>
+        <w:tc>
+          <w:tcPr>
+            <w:tcW w:type="dxa" w:w="3312"/>
+            <w:shd w:fill="17365D"/>
+          </w:tcPr>
+          <w:p>
+            <w:r>
+              <w:rPr>
+                <w:b/>
+                <w:color w:val="FFFFFF"/>
+                <w:sz w:val="16"/>
+              </w:rPr>
+              <w:t>Decision</w:t>
+            </w:r>
+          </w:p>
+        </w:tc>
+        <w:tc>
+          <w:tcPr>
+            <w:tcW w:type="dxa" w:w="3312"/>
+            <w:shd w:fill="17365D"/>
+          </w:tcPr>
+          <w:p>
+            <w:r>
+              <w:rPr>
+                <w:b/>
+                <w:color w:val="FFFFFF"/>
+                <w:sz w:val="16"/>
+              </w:rPr>
+              <w:t>First-release integration scope</w:t>
+            </w:r>
+          </w:p>
+        </w:tc>
+        <w:tc>
+          <w:tcPr>
+            <w:tcW w:type="dxa" w:w="3312"/>
+            <w:shd w:fill="17365D"/>
+          </w:tcPr>
+          <w:p>
+            <w:r>
+              <w:rPr>
+                <w:b/>
+                <w:color w:val="FFFFFF"/>
+                <w:sz w:val="16"/>
+              </w:rPr>
+              <w:t>Read-only tools/integrations only; editable drafts may be prepared in SupportIQ; no business-data writes to integrated systems and no message sending.</w:t>
+            </w:r>
+          </w:p>
+        </w:tc>
+      </w:tr>
+      <w:tr>
+        <w:trPr>
+          <w:cantSplit/>
+        </w:trPr>
+        <w:tc>
+          <w:tcPr>
+            <w:tcW w:type="dxa" w:w="3312"/>
+            <w:shd w:fill="17365D"/>
+          </w:tcPr>
+          <w:p>
+            <w:r>
+              <w:rPr>
+                <w:b/>
+                <w:color w:val="FFFFFF"/>
+                <w:sz w:val="16"/>
+              </w:rPr>
               <w:t>Open question</w:t>
             </w:r>
           </w:p>
@@ -7809,34 +7917,32 @@
         <w:tc>
           <w:tcPr>
             <w:tcW w:type="dxa" w:w="3312"/>
-            <w:vAlign w:val="center"/>
-          </w:tcPr>
-          <w:p>
-            <w:pPr>
-              <w:spacing w:after="20"/>
-            </w:pPr>
-            <w:r>
-              <w:rPr>
-                <w:sz w:val="16"/>
-              </w:rPr>
-              <w:t>How will tickets be populated?</w:t>
+            <w:shd w:fill="17365D"/>
+          </w:tcPr>
+          <w:p>
+            <w:r>
+              <w:rPr>
+                <w:b/>
+                <w:color w:val="FFFFFF"/>
+                <w:sz w:val="16"/>
+              </w:rPr>
+              <w:t>Numeric evaluation quality thresholds</w:t>
             </w:r>
           </w:p>
         </w:tc>
         <w:tc>
           <w:tcPr>
             <w:tcW w:type="dxa" w:w="3312"/>
-            <w:vAlign w:val="center"/>
-          </w:tcPr>
-          <w:p>
-            <w:pPr>
-              <w:spacing w:after="20"/>
-            </w:pPr>
-            <w:r>
-              <w:rPr>
-                <w:sz w:val="16"/>
-              </w:rPr>
-              <w:t>Prefer a deterministic synthetic seed script for release one.</w:t>
+            <w:shd w:fill="17365D"/>
+          </w:tcPr>
+          <w:p>
+            <w:r>
+              <w:rPr>
+                <w:b/>
+                <w:color w:val="FFFFFF"/>
+                <w:sz w:val="16"/>
+              </w:rPr>
+              <w:t>Define and obtain explicit human approval for numeric quality thresholds before release; this update sets no values.</w:t>
             </w:r>
           </w:p>
         </w:tc>

</xml_diff>